<commit_message>
GS3M PoE datasheet: UAT sensitivity -90dBm to 0dBm, same as the 1090U
Sensitivity row gets a second line, UAT: -90dBm to 0dBm, and the 20261016 revision line now says
-90dBm to 0dBm for Mode S and UAT.
</commit_message>
<xml_diff>
--- a/word/datasheet_gs3m_poe.docx
+++ b/word/datasheet_gs3m_poe.docx
@@ -531,6 +531,11 @@
           <w:p>
             <w:r>
               <w:t>Mode S: -90dBm to 0dBm</w:t>
+            </w:r>
+          </w:p>
+          <w:p>
+            <w:r>
+              <w:t>UAT: -90dBm to 0dBm</w:t>
             </w:r>
           </w:p>
         </w:tc>
@@ -1774,7 +1779,7 @@
     <w:p>
       <w:pPr/>
       <w:r>
-        <w:t>20261016 – Sensitivity is -90dBm to 0dBm for Mode S.</w:t>
+        <w:t>20261016 – Sensitivity is -90dBm to 0dBm for Mode S and UAT.</w:t>
       </w:r>
     </w:p>
     <w:p>

</xml_diff>